<commit_message>
Rapor 4: plainer report wording, fix Basic config reference
Removes a note meant for the author from the table of contents page,
drops filler sentences and decorative labels, and corrects the README:
Basic was trained with config/basic_short.yaml, not config/ppo/Basic.yaml.
</commit_message>
<xml_diff>
--- a/docs/week05/Rapor4_Hafta5_ML-Agents.docx
+++ b/docs/week05/Rapor4_Hafta5_ML-Agents.docx
@@ -224,7 +224,7 @@
         </w:rPr>
         <w:t xml:space="preserve">GitHub deposu: </w:t>
       </w:r>
-      <w:hyperlink w:history="1" r:id="rIdr4qlxhspmnge05ntyhifn">
+      <w:hyperlink w:history="1" r:id="rIdmcsi7pbles3eu0ymgfzaw">
         <w:r>
           <w:rPr>
             <w:rStyle w:val="Hyperlink"/>
@@ -244,7 +244,7 @@
         </w:rPr>
         <w:t xml:space="preserve">Bu haftanın dalı: </w:t>
       </w:r>
-      <w:hyperlink w:history="1" r:id="rId_xtldylzp-6zwcahtgkeu">
+      <w:hyperlink w:history="1" r:id="rIdbi3k9hdletfdij9jwugtt">
         <w:r>
           <w:rPr>
             <w:rStyle w:val="Hyperlink"/>
@@ -288,18 +288,6 @@
         </w:p>
       </w:sdtContent>
     </w:sdt>
-    <w:p>
-      <w:pPr>
-        <w:spacing w:after="120" w:line="300"/>
-      </w:pPr>
-      <w:r>
-        <w:rPr>
-          <w:i/>
-          <w:iCs/>
-        </w:rPr>
-        <w:t xml:space="preserve">Not: İçindekiler tablosu Word'de açılınca otomatik dolar. Boş görünürse sağ tık → Alanı Güncelleştir.</w:t>
-      </w:r>
-    </w:p>
     <w:p>
       <w:pPr>
         <w:pStyle w:val="Heading1"/>
@@ -1472,7 +1460,7 @@
         <w:spacing w:after="120" w:line="300"/>
       </w:pPr>
       <w:r>
-        <w:t xml:space="preserve">Sunuda vurgulandığı gibi, Unity paketi ile Python trainer sürümleri rastgele bir araya getirilmemiş, tek bir eşleşen kaynak ağacı kullanılmıştır. Tercih edilen yol, Unity paketi 4.1.0'ın yayımlandığı repo revizyonudur (commit ee0a08c).</w:t>
+        <w:t xml:space="preserve">Sunudaki sürüm politikasına uyularak Unity paketi ve Python trainer aynı kaynak ağacından alınmıştır: Unity paketi 4.1.0'ın yayımlandığı repo revizyonu (commit ee0a08c).</w:t>
       </w:r>
     </w:p>
     <w:tbl>
@@ -2556,7 +2544,7 @@
         <w:t xml:space="preserve">Doğrulama: </w:t>
       </w:r>
       <w:r>
-        <w:t xml:space="preserve">Projede paket, Unity Package Registry'den (4.1.0) yüklendi. Bu paketin Runtime/ klasörü, klonlanan kaynaktaki com.unity.ml-agents/Runtime ile diff aracıyla karşılaştırıldı. Satır sonu (CRLF/LF) dışında hiçbir fark bulunmadı. Yani Unity tarafı ile Python tarafı aynı kaynak revizyonuna aittir.</w:t>
+        <w:t xml:space="preserve">Projede paket, Unity Package Registry'den (4.1.0) yüklendi. Bu paketin Runtime/ klasörü, klonlanan kaynaktaki com.unity.ml-agents/Runtime ile diff aracıyla karşılaştırıldı. Satır sonu (CRLF/LF) dışında fark bulunmadı, yani Unity tarafı ile Python tarafı aynı revizyondan geliyor.</w:t>
       </w:r>
     </w:p>
     <w:p>
@@ -3446,7 +3434,7 @@
         <w:spacing w:after="120" w:line="300"/>
       </w:pPr>
       <w:r>
-        <w:t xml:space="preserve">Ajan bir Rigidbody ile fizik motoruna bağlıdır. Sunuda vurgulandığı gibi, dinamik bir Rigidbody her karede transform.position ile değil, kuvvet uygulanarak hareket ettirilir. Böylece momentum, sürtünme ve düşme gibi etkileri fizik motoru hesaplar.</w:t>
+        <w:t xml:space="preserve">Ajanı fizik motoruna Rigidbody bileşeni bağlar. Sunudaki kurala göre dinamik bir Rigidbody'yi her karede transform.position ile taşımak yerine ona kuvvet uygulanır; momentumu, sürtünmeyi ve düşmeyi fizik motoru hesaplar.</w:t>
       </w:r>
     </w:p>
     <w:p>
@@ -4074,7 +4062,7 @@
         <w:t xml:space="preserve">Aksiyonu kuvvet olarak uygulamak: </w:t>
       </w:r>
       <w:r>
-        <w:t xml:space="preserve">Ajan konumu doğrudan değiştirmez, fiziksel bir itme uygular. Bu, Hafta 3'te işlenen F = m·a ilişkisinin doğrudan uygulamasıdır.</w:t>
+        <w:t xml:space="preserve">Aksiyon Rigidbody'ye bir itme kuvveti olarak verilir. Topun ne kadar hızlanacağını, Hafta 3'te işlenen F = m·a ilişkisine göre fizik motoru hesaplar.</w:t>
       </w:r>
     </w:p>
     <w:p>
@@ -5988,7 +5976,7 @@
         <w:spacing w:after="120" w:line="300"/>
       </w:pPr>
       <w:r>
-        <w:t xml:space="preserve">-areas 9 argümanı, yazdığımız TrainingAreaReplicator.cs scripti ile sahnedeki eğitim alanını 9 kopyaya çıkarır. Dokuz ajan aynı politikayı paylaşarak paralel deneyim toplar. Bu sadece duvar saati süresini kısaltır; toplam adım bütçesi (200.000) değişmez. Her eğitim CPU üzerinde yaklaşık 4–13 dakika sürdü.</w:t>
+        <w:t xml:space="preserve">-areas 9 argümanı, yazdığımız TrainingAreaReplicator.cs scripti ile sahnedeki eğitim alanını 9 kopyaya çıkarır. Dokuz ajan aynı politikayı paylaşarak paralel deneyim toplar. Bu sadece duvar saati süresini kısaltır; toplam adım bütçesi (200.000) değişmez. Her eğitim CPU üzerinde 4 ile 13 dakika arasında sürdü.</w:t>
       </w:r>
     </w:p>
     <w:p>
@@ -6197,7 +6185,7 @@
         <w:spacing w:after="120" w:line="300"/>
       </w:pPr>
       <w:r>
-        <w:t xml:space="preserve">Sunuda "öğrenme sürecinin çıktılarına bakmadan başarılı demiyoruz" ilkesi vurgulanmıştır. Bu nedenle sunudaki deney disiplini uygulanmıştır:</w:t>
+        <w:t xml:space="preserve">Sunu 2, öğrenme sürecinin çıktılarına bakmadan "başarılı" denmemesini ister ve bunun için bir deney düzeni önerir. Bu düzen şöyle uygulandı:</w:t>
       </w:r>
     </w:p>
     <w:p>
@@ -6210,13 +6198,6 @@
         <w:spacing w:after="60" w:line="288"/>
       </w:pPr>
       <w:r>
-        <w:rPr>
-          <w:b/>
-          <w:bCs/>
-        </w:rPr>
-        <w:t xml:space="preserve">Birkaç seed: </w:t>
-      </w:r>
-      <w:r>
         <w:t xml:space="preserve">Her yapılandırma 3 farklı rastgele tohumla (seed 1, 2, 3) baştan eğitildi.</w:t>
       </w:r>
     </w:p>
@@ -6230,14 +6211,7 @@
         <w:spacing w:after="60" w:line="288"/>
       </w:pPr>
       <w:r>
-        <w:rPr>
-          <w:b/>
-          <w:bCs/>
-        </w:rPr>
-        <w:t xml:space="preserve">Aynı eğitim bütçesi: </w:t>
-      </w:r>
-      <w:r>
-        <w:t xml:space="preserve">Her eğitim 200.000 adım.</w:t>
+        <w:t xml:space="preserve">Her eğitimin bütçesi 200.000 adımdı.</w:t>
       </w:r>
     </w:p>
     <w:p>
@@ -6250,14 +6224,7 @@
         <w:spacing w:after="60" w:line="288"/>
       </w:pPr>
       <w:r>
-        <w:rPr>
-          <w:b/>
-          <w:bCs/>
-        </w:rPr>
-        <w:t xml:space="preserve">Aynı başlangıç koşulları: </w:t>
-      </w:r>
-      <w:r>
-        <w:t xml:space="preserve">Her politika, Unity'ye aynı seed (12345) verilerek aynı 200 hedef konumunda test edildi. Böylece k. denemede her politika aynı hedefle karşılaştı.</w:t>
+        <w:t xml:space="preserve">Her politika, Unity'ye aynı seed (12345) verilerek aynı 200 hedef konumunda test edildi; k. denemede her politika aynı hedefle karşılaştı.</w:t>
       </w:r>
     </w:p>
     <w:p>
@@ -6270,14 +6237,7 @@
         <w:spacing w:after="60" w:line="288"/>
       </w:pPr>
       <w:r>
-        <w:rPr>
-          <w:b/>
-          <w:bCs/>
-        </w:rPr>
-        <w:t xml:space="preserve">Karşılaştırma: </w:t>
-      </w:r>
-      <w:r>
-        <w:t xml:space="preserve">Eğitimsiz rastgele politika (alt sınır) ve kural tabanlı bir kontrolcü ("hedefe doğru it, hız kadar fren yap"). Kural tabanlı kontrolcü, klavye heuristic'inin otomatik karşılığı olarak kullanıldı.</w:t>
+        <w:t xml:space="preserve">Karşılaştırma için eğitimsiz rastgele bir politika (alt sınır) ve kural tabanlı bir kontrolcü kullanıldı. Kontrolcü topu hedefe doğru itiyor ve hızı kadar fren yapıyor; klavye heuristic'inin otomatik karşılığıdır.</w:t>
       </w:r>
     </w:p>
     <w:p>
@@ -6290,14 +6250,7 @@
         <w:spacing w:after="60" w:line="288"/>
       </w:pPr>
       <w:r>
-        <w:rPr>
-          <w:b/>
-          <w:bCs/>
-        </w:rPr>
-        <w:t xml:space="preserve">Ölçütler: </w:t>
-      </w:r>
-      <w:r>
-        <w:t xml:space="preserve">Başarı oranı, düşme oranı, zaman aşımı oranı, ortalama episode uzunluğu ve hedefe ortalama varış süresi (1 adım = 0.02 s).</w:t>
+        <w:t xml:space="preserve">Ölçülenler: başarı, düşme ve zaman aşımı oranları, ortalama episode uzunluğu ve hedefe ortalama varış süresi (1 adım = 0.02 s).</w:t>
       </w:r>
     </w:p>
     <w:p>
@@ -7383,7 +7336,7 @@
           <wp:inline distT="0" distB="0" distL="0" distR="0">
             <wp:extent cx="5905500" cy="3133725"/>
             <wp:effectExtent t="0" r="0" b="0" l="0"/>
-            <wp:docPr id="1" name="training_curves_all.png" descr="Şekil 11. Eğitim boyunca metrikler (çizgi: 3 seed ortalaması, gölge: en düşük–en yüksek seed)" title="Şekil 11. Eğitim boyunca metrikler (çizgi: 3 seed ortalaması, gölge: en düşük–en yüksek seed)"/>
+            <wp:docPr id="1" name="training_curves_all.png" descr="Şekil 11. Eğitim boyunca metrikler (çizgi: 3 seed ortalaması, gölge: en düşük ile en yüksek seed arası)" title="Şekil 11. Eğitim boyunca metrikler (çizgi: 3 seed ortalaması, gölge: en düşük ile en yüksek seed arası)"/>
             <wp:cNvGraphicFramePr>
               <a:graphicFrameLocks xmlns:a="http://schemas.openxmlformats.org/drawingml/2006/main" noChangeAspect="1"/>
             </wp:cNvGraphicFramePr>
@@ -7432,7 +7385,7 @@
           <w:sz w:val="19"/>
           <w:szCs w:val="19"/>
         </w:rPr>
-        <w:t xml:space="preserve">Şekil 11. Eğitim boyunca metrikler (çizgi: 3 seed ortalaması, gölge: en düşük–en yüksek seed)</w:t>
+        <w:t xml:space="preserve">Şekil 11. Eğitim boyunca metrikler (çizgi: 3 seed ortalaması, gölge: en düşük ile en yüksek seed arası)</w:t>
       </w:r>
     </w:p>
     <w:p>
@@ -7515,14 +7468,7 @@
         <w:ind w:left="200" w:right="200"/>
       </w:pPr>
       <w:r>
-        <w:rPr>
-          <w:b/>
-          <w:bCs/>
-        </w:rPr>
-        <w:t xml:space="preserve">Çıkarım: </w:t>
-      </w:r>
-      <w:r>
-        <w:t xml:space="preserve">Aynı kod ve aynı ayarlarla yalnızca seed değiştiğinde sonuç %80 ile %100 arasında değişebiliyor. Sunudaki "tek run yeterli kanıt değildir" uyarısı bu deneyle doğrulanmış oldu. Raporlanan değerlerin ortalama ± sapma olarak verilmesinin nedeni budur.</w:t>
+        <w:t xml:space="preserve">Aynı kod ve ayarlarla yalnızca seed değiştiğinde başarı %80 ile %100 arasında değişti. Sunudaki "tek run yeterli kanıt değildir" uyarısı bu yüzden önemli; bu raporda PPO sonuçları 3 seed'in ortalaması ± standart sapması olarak verilmiştir.</w:t>
       </w:r>
     </w:p>
     <w:p>
@@ -7539,7 +7485,7 @@
         <w:spacing w:after="120" w:line="300"/>
       </w:pPr>
       <w:r>
-        <w:t xml:space="preserve">Sunu 2'nin son slaytında, hazır kodu değiştirmekten çok bilimsel bir hipotez kurup test etmek hedeflenmiştir. İki deney yapıldı. Kodda yalnızca CollectObservations ve Space Size değişti. Bunun için ajana bir ObservationMode ayarı eklendi; build'e komut satırından -obsMode argümanı verilerek seçilebiliyor.</w:t>
+        <w:t xml:space="preserve">Sunu 2'nin son slaytı, gözlem setini değiştirerek bir hipotezi test etmeyi ister. Bunun için iki deney yapıldı. Kodda yalnızca CollectObservations ve Space Size değişti. Bunun için ajana bir ObservationMode ayarı eklendi; build'e komut satırından -obsMode argümanı verilerek seçilebiliyor.</w:t>
       </w:r>
     </w:p>
     <w:tbl>
@@ -7790,7 +7736,7 @@
                 <w:sz w:val="19"/>
                 <w:szCs w:val="19"/>
               </w:rPr>
-              <w:t xml:space="preserve">–</w:t>
+              <w:t xml:space="preserve">(karşılaştırma tabanı)</w:t>
             </w:r>
           </w:p>
         </w:tc>
@@ -9754,7 +9700,7 @@
         <w:t xml:space="preserve">98.5 / %96.5 / %94.5</w:t>
       </w:r>
       <w:r>
-        <w:t xml:space="preserve">). Nedeni şudur: mutlak konumla eğitilen ajan hep merkezden başladığı için yalnızca "merkezden hedefe giden" durumları görmüştür; başka bir yerden başladığında ezberlediği durumların dışına çıkar. Göreli gözlemde "hedef 2 m sağımda" durumu zeminin neresinde olursa olsun aynı sayılarla ifade edilir. Öğrenilen davranış böylece her yere taşınabilir (öteleme değişmezliği).</w:t>
+        <w:t xml:space="preserve">). Mutlak konumla eğitilen ajan hep merkezden başladığı için yalnızca "merkezden hedefe giden" durumları görmüştür; başka bir yerden başladığında ezberlediği durumların dışına çıkar. Göreli gözlemde "hedef 2 m sağımda" durumu zeminin neresinde olursa olsun aynı sayılarla ifade edilir. Öğrenilen davranış böylece her yere taşınabilir (öteleme değişmezliği).</w:t>
       </w:r>
     </w:p>
     <w:p>
@@ -9832,7 +9778,7 @@
         <w:spacing w:after="120" w:line="300"/>
       </w:pPr>
       <w:r>
-        <w:t xml:space="preserve">Bu ortamda şart değil. Düşmek episode'u ödülsüz bitirdiği için zaten ödülden vazgeçmek demektir. Eğitimin ilk 10.000 adımında episode'ların %50–94'ü düşmeyle bitiyordu. Eğitim sonunda bu oran 9 eğitimin 8'inde %0–0.4'e indi; yalnızca baseline seed 2'de %24'te kaldı (Şekil 11). Düşmeye büyük bir ceza vermek, ajanın kenardan aşırı kaçmasına ve hedef kenardayken çekingen davranmasına yol açabilir. Küçük bir adım cezası ise hızlı gitmeyi teşvik eder; ajan kodunda bu seçenek (stepPenalty) eklendi ancak sunudaki temel tasarıma sadık kalmak için 0 bırakıldı.</w:t>
+        <w:t xml:space="preserve">Bu ortamda şart değil. Düşmek episode'u ödülsüz bitirdiği için zaten ödülden vazgeçmek demektir. Eğitimin ilk 10.000 adımında episode'ların %50 ile %94'ü düşmeyle bitiyordu. Eğitim sonunda bu oran 9 eğitimin 8'inde %0.4'ün altına indi; yalnızca baseline seed 2'de %24'te kaldı (Şekil 11). Düşmeye büyük bir ceza vermek, ajanın kenardan aşırı kaçmasına ve hedef kenardayken çekingen davranmasına yol açabilir. Küçük bir adım cezası ise hızlı gitmeyi teşvik eder; ajan kodunda bu seçenek (stepPenalty) eklendi ancak sunudaki temel tasarıma sadık kalmak için 0 bırakıldı.</w:t>
       </w:r>
     </w:p>
     <w:p>
@@ -9848,7 +9794,7 @@
         <w:spacing w:after="120" w:line="300"/>
       </w:pPr>
       <w:r>
-        <w:t xml:space="preserve">MaxStep olmasaydı, hiçbir şey yapmayan ya da hedefin etrafında dönen bir ajan sonsuza kadar aynı episode'da kalabilirdi. Eğitim yeni hedef konumları görmez ve öğrenme takılırdı. Eğitimin ilk 10.000 adımında episode'ların %0–6'sı (rastgele politikada %9.5'i) zaman aşımıyla bitiyordu; eğitim sonunda bu oran tüm eğitimlerde %0'a indi.</w:t>
+        <w:t xml:space="preserve">MaxStep olmasaydı, hiçbir şey yapmayan ya da hedefin etrafında dönen bir ajan sonsuza kadar aynı episode'da kalabilirdi. Eğitim yeni hedef konumları görmez ve öğrenme takılırdı. Eğitimin ilk 10.000 adımında episode'ların en fazla %6'sı (rastgele politikada %9.5'i) zaman aşımıyla bitiyordu; eğitim sonunda bu oran tüm eğitimlerde %0'a indi.</w:t>
       </w:r>
     </w:p>
     <w:p>
@@ -10296,7 +10242,7 @@
                 <w:sz w:val="19"/>
                 <w:szCs w:val="19"/>
               </w:rPr>
-              <w:t xml:space="preserve">–</w:t>
+              <w:t xml:space="preserve">Makinede Python 3.10 da yoktu</w:t>
             </w:r>
           </w:p>
         </w:tc>
@@ -10483,7 +10429,7 @@
         <w:spacing w:after="60" w:line="288"/>
       </w:pPr>
       <w:r>
-        <w:t xml:space="preserve">Seed'ler arasında belirgin bir sapma gözlenmiştir. Bu durum, RL sonuçlarının birden fazla seed ile raporlanması gerektiğini göstermektedir.</w:t>
+        <w:t xml:space="preserve">Baseline'da yalnızca seed değiştiğinde başarı %80 ile %100 arasında değişti; RL sonuçlarını tek bir eğitimle raporlamak yanıltıcı olur.</w:t>
       </w:r>
     </w:p>
     <w:p>
@@ -10496,7 +10442,7 @@
         <w:spacing w:after="60" w:line="288"/>
       </w:pPr>
       <w:r>
-        <w:t xml:space="preserve">Gözlem tasarımı, ödül kadar önemlidir. Göreli konum kullanmak, ajanın yeni durumlara genellemesini %</w:t>
+        <w:t xml:space="preserve">Gözlem tasarımı sonucu belirgin biçimde etkiledi: göreli konum kullanmak, ajanın yeni durumlara genellemesini %</w:t>
       </w:r>
       <w:r>
         <w:t xml:space="preserve">48.0</w:t>
@@ -10546,7 +10492,7 @@
         </w:rPr>
         <w:t xml:space="preserve">Depo: </w:t>
       </w:r>
-      <w:hyperlink w:history="1" r:id="rIdxrloskjfpanri7kotcpmi">
+      <w:hyperlink w:history="1" r:id="rIdb9m7cw7f4bufzefcgzxu3">
         <w:r>
           <w:rPr>
             <w:rStyle w:val="Hyperlink"/>
@@ -10560,7 +10506,7 @@
         <w:spacing w:after="120" w:line="300"/>
       </w:pPr>
       <w:r>
-        <w:t xml:space="preserve">Hocanın Lecture I'de tanımladığı akış izlenmiştir. main dalında temel Unity projesi bulunur. Bu haftanın işi </w:t>
+        <w:t xml:space="preserve">Lecture I'de tanımlanan akış izlenmiştir. main dalında temel Unity projesi bulunur. Bu haftanın işi </w:t>
       </w:r>
       <w:r>
         <w:rPr>
@@ -10572,7 +10518,7 @@
         <w:t xml:space="preserve">feature/week05-ml-agents</w:t>
       </w:r>
       <w:r>
-        <w:t xml:space="preserve"> dalında anlamlı commit'lerle geliştirilmiş, Pull Request şablonu (.github/pull_request_template.md) ile main dalına birleştirilmek üzere hazırlanmıştır. Unity'nin ürettiği Library, Temp, Logs ve Builds klasörleri .gitignore ile hariç tutulmuştur.</w:t>
+        <w:t xml:space="preserve"> dalında anlamlı commit'lerle geliştirilmiş ve Pull Request #1 ile (şablon: .github/pull_request_template.md) main dalına birleştirilmiştir. Unity'nin ürettiği Library, Temp, Logs ve Builds klasörleri .gitignore ile hariç tutulmuştur.</w:t>
       </w:r>
     </w:p>
     <w:p>
@@ -10768,7 +10714,7 @@
       <w:r>
         <w:t xml:space="preserve">Unity Technologies, Unity ML-Agents Toolkit, GitHub deposu, </w:t>
       </w:r>
-      <w:hyperlink w:history="1" r:id="rIdixr4qg6vf9aqtjh45l46x">
+      <w:hyperlink w:history="1" r:id="rIdwlk74k_utojtoyclzk8yk">
         <w:r>
           <w:rPr>
             <w:rStyle w:val="Hyperlink"/>

</xml_diff>